<commit_message>
Add Coogle data cert
</commit_message>
<xml_diff>
--- a/cv/ScottMcKissockCV.docx
+++ b/cv/ScottMcKissockCV.docx
@@ -757,7 +757,27 @@
           <w:sz w:val="24"/>
           <w:szCs w:val="24"/>
         </w:rPr>
-        <w:t xml:space="preserve"> Azure Sql Database, Blob Storage, App Services and integrate</w:t>
+        <w:t xml:space="preserve"> Azure </w:t>
+      </w:r>
+      <w:proofErr w:type="spellStart"/>
+      <w:r>
+        <w:rPr>
+          <w:rFonts w:ascii="Helvetica" w:eastAsia="Times New Roman" w:hAnsi="Helvetica" w:cs="Helvetica"/>
+          <w:color w:val="212121"/>
+          <w:sz w:val="24"/>
+          <w:szCs w:val="24"/>
+        </w:rPr>
+        <w:t>Sql</w:t>
+      </w:r>
+      <w:proofErr w:type="spellEnd"/>
+      <w:r>
+        <w:rPr>
+          <w:rFonts w:ascii="Helvetica" w:eastAsia="Times New Roman" w:hAnsi="Helvetica" w:cs="Helvetica"/>
+          <w:color w:val="212121"/>
+          <w:sz w:val="24"/>
+          <w:szCs w:val="24"/>
+        </w:rPr>
+        <w:t xml:space="preserve"> Database, Blob Storage, App Services and integrate</w:t>
       </w:r>
       <w:r>
         <w:rPr>
@@ -4322,7 +4342,107 @@
           <w:sz w:val="24"/>
           <w:szCs w:val="24"/>
         </w:rPr>
-        <w:t xml:space="preserve"> d3.js/crossfilter/javascript; backend was developed with Python, FastApi, SQLModel, PostgreSQL, LangChain, Chroma,</w:t>
+        <w:t xml:space="preserve"> d3.js/</w:t>
+      </w:r>
+      <w:proofErr w:type="spellStart"/>
+      <w:r>
+        <w:rPr>
+          <w:rFonts w:ascii="Helvetica" w:eastAsia="Times New Roman" w:hAnsi="Helvetica" w:cs="Helvetica"/>
+          <w:color w:val="212121"/>
+          <w:sz w:val="24"/>
+          <w:szCs w:val="24"/>
+        </w:rPr>
+        <w:t>crossfilter</w:t>
+      </w:r>
+      <w:proofErr w:type="spellEnd"/>
+      <w:r>
+        <w:rPr>
+          <w:rFonts w:ascii="Helvetica" w:eastAsia="Times New Roman" w:hAnsi="Helvetica" w:cs="Helvetica"/>
+          <w:color w:val="212121"/>
+          <w:sz w:val="24"/>
+          <w:szCs w:val="24"/>
+        </w:rPr>
+        <w:t>/</w:t>
+      </w:r>
+      <w:proofErr w:type="spellStart"/>
+      <w:r>
+        <w:rPr>
+          <w:rFonts w:ascii="Helvetica" w:eastAsia="Times New Roman" w:hAnsi="Helvetica" w:cs="Helvetica"/>
+          <w:color w:val="212121"/>
+          <w:sz w:val="24"/>
+          <w:szCs w:val="24"/>
+        </w:rPr>
+        <w:t>javascript</w:t>
+      </w:r>
+      <w:proofErr w:type="spellEnd"/>
+      <w:r>
+        <w:rPr>
+          <w:rFonts w:ascii="Helvetica" w:eastAsia="Times New Roman" w:hAnsi="Helvetica" w:cs="Helvetica"/>
+          <w:color w:val="212121"/>
+          <w:sz w:val="24"/>
+          <w:szCs w:val="24"/>
+        </w:rPr>
+        <w:t xml:space="preserve">; backend was developed with Python, </w:t>
+      </w:r>
+      <w:proofErr w:type="spellStart"/>
+      <w:r>
+        <w:rPr>
+          <w:rFonts w:ascii="Helvetica" w:eastAsia="Times New Roman" w:hAnsi="Helvetica" w:cs="Helvetica"/>
+          <w:color w:val="212121"/>
+          <w:sz w:val="24"/>
+          <w:szCs w:val="24"/>
+        </w:rPr>
+        <w:t>FastApi</w:t>
+      </w:r>
+      <w:proofErr w:type="spellEnd"/>
+      <w:r>
+        <w:rPr>
+          <w:rFonts w:ascii="Helvetica" w:eastAsia="Times New Roman" w:hAnsi="Helvetica" w:cs="Helvetica"/>
+          <w:color w:val="212121"/>
+          <w:sz w:val="24"/>
+          <w:szCs w:val="24"/>
+        </w:rPr>
+        <w:t xml:space="preserve">, </w:t>
+      </w:r>
+      <w:proofErr w:type="spellStart"/>
+      <w:r>
+        <w:rPr>
+          <w:rFonts w:ascii="Helvetica" w:eastAsia="Times New Roman" w:hAnsi="Helvetica" w:cs="Helvetica"/>
+          <w:color w:val="212121"/>
+          <w:sz w:val="24"/>
+          <w:szCs w:val="24"/>
+        </w:rPr>
+        <w:t>SQLModel</w:t>
+      </w:r>
+      <w:proofErr w:type="spellEnd"/>
+      <w:r>
+        <w:rPr>
+          <w:rFonts w:ascii="Helvetica" w:eastAsia="Times New Roman" w:hAnsi="Helvetica" w:cs="Helvetica"/>
+          <w:color w:val="212121"/>
+          <w:sz w:val="24"/>
+          <w:szCs w:val="24"/>
+        </w:rPr>
+        <w:t xml:space="preserve">, PostgreSQL, </w:t>
+      </w:r>
+      <w:proofErr w:type="spellStart"/>
+      <w:r>
+        <w:rPr>
+          <w:rFonts w:ascii="Helvetica" w:eastAsia="Times New Roman" w:hAnsi="Helvetica" w:cs="Helvetica"/>
+          <w:color w:val="212121"/>
+          <w:sz w:val="24"/>
+          <w:szCs w:val="24"/>
+        </w:rPr>
+        <w:t>LangChain</w:t>
+      </w:r>
+      <w:proofErr w:type="spellEnd"/>
+      <w:r>
+        <w:rPr>
+          <w:rFonts w:ascii="Helvetica" w:eastAsia="Times New Roman" w:hAnsi="Helvetica" w:cs="Helvetica"/>
+          <w:color w:val="212121"/>
+          <w:sz w:val="24"/>
+          <w:szCs w:val="24"/>
+        </w:rPr>
+        <w:t>, Chroma,</w:t>
       </w:r>
       <w:r>
         <w:rPr>
@@ -4340,7 +4460,27 @@
           <w:sz w:val="24"/>
           <w:szCs w:val="24"/>
         </w:rPr>
-        <w:t xml:space="preserve">OpenAI and Anthropic apis.   </w:t>
+        <w:t xml:space="preserve">OpenAI and Anthropic </w:t>
+      </w:r>
+      <w:proofErr w:type="spellStart"/>
+      <w:r>
+        <w:rPr>
+          <w:rFonts w:ascii="Helvetica" w:eastAsia="Times New Roman" w:hAnsi="Helvetica" w:cs="Helvetica"/>
+          <w:color w:val="212121"/>
+          <w:sz w:val="24"/>
+          <w:szCs w:val="24"/>
+        </w:rPr>
+        <w:t>apis</w:t>
+      </w:r>
+      <w:proofErr w:type="spellEnd"/>
+      <w:r>
+        <w:rPr>
+          <w:rFonts w:ascii="Helvetica" w:eastAsia="Times New Roman" w:hAnsi="Helvetica" w:cs="Helvetica"/>
+          <w:color w:val="212121"/>
+          <w:sz w:val="24"/>
+          <w:szCs w:val="24"/>
+        </w:rPr>
+        <w:t xml:space="preserve">.   </w:t>
       </w:r>
     </w:p>
     <w:p>
@@ -4657,7 +4797,47 @@
           <w:sz w:val="24"/>
           <w:szCs w:val="24"/>
         </w:rPr>
-        <w:t>Developed a searchable and filterable interface for Sunlight Foundation's "Tracking Trumps Conflicts of Interest" project. Developed a json api and designed and implemented a front end based on d3.js, dc.js, and crossfilter.js.</w:t>
+        <w:t xml:space="preserve">Developed a searchable and filterable interface for Sunlight Foundation's "Tracking Trumps Conflicts of Interest" project. Developed a </w:t>
+      </w:r>
+      <w:proofErr w:type="spellStart"/>
+      <w:r>
+        <w:rPr>
+          <w:rFonts w:ascii="Helvetica" w:eastAsia="Times New Roman" w:hAnsi="Helvetica" w:cs="Helvetica"/>
+          <w:color w:val="212121"/>
+          <w:sz w:val="24"/>
+          <w:szCs w:val="24"/>
+        </w:rPr>
+        <w:t>json</w:t>
+      </w:r>
+      <w:proofErr w:type="spellEnd"/>
+      <w:r>
+        <w:rPr>
+          <w:rFonts w:ascii="Helvetica" w:eastAsia="Times New Roman" w:hAnsi="Helvetica" w:cs="Helvetica"/>
+          <w:color w:val="212121"/>
+          <w:sz w:val="24"/>
+          <w:szCs w:val="24"/>
+        </w:rPr>
+        <w:t xml:space="preserve"> </w:t>
+      </w:r>
+      <w:proofErr w:type="spellStart"/>
+      <w:r>
+        <w:rPr>
+          <w:rFonts w:ascii="Helvetica" w:eastAsia="Times New Roman" w:hAnsi="Helvetica" w:cs="Helvetica"/>
+          <w:color w:val="212121"/>
+          <w:sz w:val="24"/>
+          <w:szCs w:val="24"/>
+        </w:rPr>
+        <w:t>api</w:t>
+      </w:r>
+      <w:proofErr w:type="spellEnd"/>
+      <w:r>
+        <w:rPr>
+          <w:rFonts w:ascii="Helvetica" w:eastAsia="Times New Roman" w:hAnsi="Helvetica" w:cs="Helvetica"/>
+          <w:color w:val="212121"/>
+          <w:sz w:val="24"/>
+          <w:szCs w:val="24"/>
+        </w:rPr>
+        <w:t xml:space="preserve"> and designed and implemented a front end based on d3.js, dc.js, and crossfilter.js.</w:t>
       </w:r>
     </w:p>
     <w:p>
@@ -4951,7 +5131,67 @@
           <w:sz w:val="24"/>
           <w:szCs w:val="24"/>
         </w:rPr>
-        <w:t xml:space="preserve">Wrote backtesting software in c# for a small hedge fund, build on a large historical dataset developed from S&amp;P Compustat and proprietary data. </w:t>
+        <w:t xml:space="preserve">Wrote </w:t>
+      </w:r>
+      <w:proofErr w:type="spellStart"/>
+      <w:r>
+        <w:rPr>
+          <w:rFonts w:ascii="Helvetica" w:eastAsia="Times New Roman" w:hAnsi="Helvetica" w:cs="Helvetica"/>
+          <w:color w:val="212121"/>
+          <w:sz w:val="24"/>
+          <w:szCs w:val="24"/>
+        </w:rPr>
+        <w:t>backtesting</w:t>
+      </w:r>
+      <w:proofErr w:type="spellEnd"/>
+      <w:r>
+        <w:rPr>
+          <w:rFonts w:ascii="Helvetica" w:eastAsia="Times New Roman" w:hAnsi="Helvetica" w:cs="Helvetica"/>
+          <w:color w:val="212121"/>
+          <w:sz w:val="24"/>
+          <w:szCs w:val="24"/>
+        </w:rPr>
+        <w:t xml:space="preserve"> software in </w:t>
+      </w:r>
+      <w:proofErr w:type="spellStart"/>
+      <w:r>
+        <w:rPr>
+          <w:rFonts w:ascii="Helvetica" w:eastAsia="Times New Roman" w:hAnsi="Helvetica" w:cs="Helvetica"/>
+          <w:color w:val="212121"/>
+          <w:sz w:val="24"/>
+          <w:szCs w:val="24"/>
+        </w:rPr>
+        <w:t>c#</w:t>
+      </w:r>
+      <w:proofErr w:type="spellEnd"/>
+      <w:r>
+        <w:rPr>
+          <w:rFonts w:ascii="Helvetica" w:eastAsia="Times New Roman" w:hAnsi="Helvetica" w:cs="Helvetica"/>
+          <w:color w:val="212121"/>
+          <w:sz w:val="24"/>
+          <w:szCs w:val="24"/>
+        </w:rPr>
+        <w:t xml:space="preserve"> for a small hedge fund, build on a large historical dataset developed from S&amp;P </w:t>
+      </w:r>
+      <w:proofErr w:type="spellStart"/>
+      <w:r>
+        <w:rPr>
+          <w:rFonts w:ascii="Helvetica" w:eastAsia="Times New Roman" w:hAnsi="Helvetica" w:cs="Helvetica"/>
+          <w:color w:val="212121"/>
+          <w:sz w:val="24"/>
+          <w:szCs w:val="24"/>
+        </w:rPr>
+        <w:t>Compustat</w:t>
+      </w:r>
+      <w:proofErr w:type="spellEnd"/>
+      <w:r>
+        <w:rPr>
+          <w:rFonts w:ascii="Helvetica" w:eastAsia="Times New Roman" w:hAnsi="Helvetica" w:cs="Helvetica"/>
+          <w:color w:val="212121"/>
+          <w:sz w:val="24"/>
+          <w:szCs w:val="24"/>
+        </w:rPr>
+        <w:t xml:space="preserve"> and proprietary data. </w:t>
       </w:r>
     </w:p>
     <w:p>
@@ -5296,7 +5536,140 @@
           <w:szCs w:val="29"/>
         </w:rPr>
         <w:lastRenderedPageBreak/>
-        <w:t>Recent Training</w:t>
+        <w:t>Professional Certifications</w:t>
+      </w:r>
+    </w:p>
+    <w:p>
+      <w:pPr>
+        <w:shd w:val="clear" w:color="auto" w:fill="FFFFFF"/>
+        <w:spacing w:after="0" w:line="240" w:lineRule="auto"/>
+        <w:rPr>
+          <w:rFonts w:ascii="Helvetica" w:eastAsia="Times New Roman" w:hAnsi="Helvetica" w:cs="Helvetica"/>
+          <w:b/>
+          <w:bCs/>
+          <w:color w:val="212121"/>
+          <w:sz w:val="29"/>
+          <w:szCs w:val="29"/>
+        </w:rPr>
+      </w:pPr>
+    </w:p>
+    <w:p>
+      <w:pPr>
+        <w:shd w:val="clear" w:color="auto" w:fill="FFFFFF"/>
+        <w:spacing w:after="0" w:line="240" w:lineRule="auto"/>
+        <w:rPr>
+          <w:rFonts w:ascii="Helvetica" w:eastAsia="Times New Roman" w:hAnsi="Helvetica" w:cs="Helvetica"/>
+          <w:b/>
+          <w:bCs/>
+          <w:color w:val="212121"/>
+          <w:sz w:val="29"/>
+          <w:szCs w:val="29"/>
+        </w:rPr>
+      </w:pPr>
+      <w:r>
+        <w:rPr>
+          <w:rFonts w:ascii="Helvetica" w:eastAsia="Times New Roman" w:hAnsi="Helvetica" w:cs="Helvetica"/>
+          <w:b/>
+          <w:bCs/>
+          <w:color w:val="212121"/>
+          <w:sz w:val="29"/>
+          <w:szCs w:val="29"/>
+        </w:rPr>
+        <w:t>Google</w:t>
+      </w:r>
+    </w:p>
+    <w:p>
+      <w:pPr>
+        <w:shd w:val="clear" w:color="auto" w:fill="FFFFFF"/>
+        <w:spacing w:after="0" w:line="240" w:lineRule="auto"/>
+        <w:rPr>
+          <w:rFonts w:ascii="Helvetica" w:eastAsia="Times New Roman" w:hAnsi="Helvetica" w:cs="Helvetica"/>
+          <w:color w:val="212121"/>
+          <w:sz w:val="29"/>
+          <w:szCs w:val="29"/>
+        </w:rPr>
+      </w:pPr>
+      <w:r>
+        <w:rPr>
+          <w:rFonts w:ascii="Helvetica" w:eastAsia="Times New Roman" w:hAnsi="Helvetica" w:cs="Helvetica"/>
+          <w:color w:val="212121"/>
+          <w:sz w:val="29"/>
+          <w:szCs w:val="29"/>
+        </w:rPr>
+        <w:t xml:space="preserve">Professional Data </w:t>
+      </w:r>
+      <w:proofErr w:type="gramStart"/>
+      <w:r>
+        <w:rPr>
+          <w:rFonts w:ascii="Helvetica" w:eastAsia="Times New Roman" w:hAnsi="Helvetica" w:cs="Helvetica"/>
+          <w:color w:val="212121"/>
+          <w:sz w:val="29"/>
+          <w:szCs w:val="29"/>
+        </w:rPr>
+        <w:t>Engineer  August</w:t>
+      </w:r>
+      <w:proofErr w:type="gramEnd"/>
+      <w:r>
+        <w:rPr>
+          <w:rFonts w:ascii="Helvetica" w:eastAsia="Times New Roman" w:hAnsi="Helvetica" w:cs="Helvetica"/>
+          <w:color w:val="212121"/>
+          <w:sz w:val="29"/>
+          <w:szCs w:val="29"/>
+        </w:rPr>
+        <w:t xml:space="preserve"> 2025</w:t>
+      </w:r>
+    </w:p>
+    <w:p>
+      <w:pPr>
+        <w:shd w:val="clear" w:color="auto" w:fill="FFFFFF"/>
+        <w:spacing w:after="0" w:line="240" w:lineRule="auto"/>
+        <w:rPr>
+          <w:rFonts w:ascii="Helvetica" w:eastAsia="Times New Roman" w:hAnsi="Helvetica" w:cs="Helvetica"/>
+          <w:b/>
+          <w:bCs/>
+          <w:color w:val="212121"/>
+          <w:sz w:val="29"/>
+          <w:szCs w:val="29"/>
+        </w:rPr>
+      </w:pPr>
+    </w:p>
+    <w:p>
+      <w:pPr>
+        <w:shd w:val="clear" w:color="auto" w:fill="FFFFFF"/>
+        <w:spacing w:after="0" w:line="240" w:lineRule="auto"/>
+        <w:rPr>
+          <w:rFonts w:ascii="Helvetica" w:eastAsia="Times New Roman" w:hAnsi="Helvetica" w:cs="Helvetica"/>
+          <w:b/>
+          <w:bCs/>
+          <w:color w:val="212121"/>
+          <w:sz w:val="29"/>
+          <w:szCs w:val="29"/>
+        </w:rPr>
+      </w:pPr>
+    </w:p>
+    <w:p>
+      <w:pPr>
+        <w:shd w:val="clear" w:color="auto" w:fill="FFFFFF"/>
+        <w:spacing w:after="0" w:line="240" w:lineRule="auto"/>
+        <w:rPr>
+          <w:rFonts w:ascii="Helvetica" w:eastAsia="Times New Roman" w:hAnsi="Helvetica" w:cs="Helvetica"/>
+          <w:b/>
+          <w:bCs/>
+          <w:color w:val="212121"/>
+          <w:sz w:val="29"/>
+          <w:szCs w:val="29"/>
+        </w:rPr>
+      </w:pPr>
+      <w:r>
+        <w:rPr>
+          <w:rFonts w:ascii="Helvetica" w:eastAsia="Times New Roman" w:hAnsi="Helvetica" w:cs="Helvetica"/>
+          <w:b/>
+          <w:bCs/>
+          <w:color w:val="212121"/>
+          <w:sz w:val="29"/>
+          <w:szCs w:val="29"/>
+        </w:rPr>
+        <w:t>Training</w:t>
       </w:r>
     </w:p>
     <w:p>
@@ -5392,37 +5765,61 @@
           <w:szCs w:val="26"/>
         </w:rPr>
       </w:pPr>
-      <w:r>
-        <w:rPr>
-          <w:rFonts w:ascii="Helvetica" w:eastAsia="Times New Roman" w:hAnsi="Helvetica" w:cs="Helvetica"/>
-          <w:b/>
-          <w:bCs/>
-          <w:color w:val="212121"/>
-          <w:sz w:val="26"/>
-          <w:szCs w:val="26"/>
-        </w:rPr>
-        <w:t>Dagster University</w:t>
-      </w:r>
-    </w:p>
-    <w:p>
-      <w:pPr>
-        <w:shd w:val="clear" w:color="auto" w:fill="FFFFFF"/>
-        <w:spacing w:after="0" w:line="240" w:lineRule="auto"/>
-        <w:rPr>
-          <w:rFonts w:ascii="Helvetica" w:eastAsia="Times New Roman" w:hAnsi="Helvetica" w:cs="Helvetica"/>
-          <w:color w:val="212121"/>
-          <w:sz w:val="26"/>
-          <w:szCs w:val="26"/>
-        </w:rPr>
-      </w:pPr>
-      <w:r>
-        <w:rPr>
-          <w:rFonts w:ascii="Helvetica" w:eastAsia="Times New Roman" w:hAnsi="Helvetica" w:cs="Helvetica"/>
-          <w:color w:val="212121"/>
-          <w:sz w:val="26"/>
-          <w:szCs w:val="26"/>
-        </w:rPr>
-        <w:t xml:space="preserve">Dagster </w:t>
+      <w:proofErr w:type="spellStart"/>
+      <w:r>
+        <w:rPr>
+          <w:rFonts w:ascii="Helvetica" w:eastAsia="Times New Roman" w:hAnsi="Helvetica" w:cs="Helvetica"/>
+          <w:b/>
+          <w:bCs/>
+          <w:color w:val="212121"/>
+          <w:sz w:val="26"/>
+          <w:szCs w:val="26"/>
+        </w:rPr>
+        <w:t>Dagster</w:t>
+      </w:r>
+      <w:proofErr w:type="spellEnd"/>
+      <w:r>
+        <w:rPr>
+          <w:rFonts w:ascii="Helvetica" w:eastAsia="Times New Roman" w:hAnsi="Helvetica" w:cs="Helvetica"/>
+          <w:b/>
+          <w:bCs/>
+          <w:color w:val="212121"/>
+          <w:sz w:val="26"/>
+          <w:szCs w:val="26"/>
+        </w:rPr>
+        <w:t xml:space="preserve"> University</w:t>
+      </w:r>
+    </w:p>
+    <w:p>
+      <w:pPr>
+        <w:shd w:val="clear" w:color="auto" w:fill="FFFFFF"/>
+        <w:spacing w:after="0" w:line="240" w:lineRule="auto"/>
+        <w:rPr>
+          <w:rFonts w:ascii="Helvetica" w:eastAsia="Times New Roman" w:hAnsi="Helvetica" w:cs="Helvetica"/>
+          <w:color w:val="212121"/>
+          <w:sz w:val="26"/>
+          <w:szCs w:val="26"/>
+        </w:rPr>
+      </w:pPr>
+      <w:proofErr w:type="spellStart"/>
+      <w:r>
+        <w:rPr>
+          <w:rFonts w:ascii="Helvetica" w:eastAsia="Times New Roman" w:hAnsi="Helvetica" w:cs="Helvetica"/>
+          <w:color w:val="212121"/>
+          <w:sz w:val="26"/>
+          <w:szCs w:val="26"/>
+        </w:rPr>
+        <w:t>Dagster</w:t>
+      </w:r>
+      <w:proofErr w:type="spellEnd"/>
+      <w:r>
+        <w:rPr>
+          <w:rFonts w:ascii="Helvetica" w:eastAsia="Times New Roman" w:hAnsi="Helvetica" w:cs="Helvetica"/>
+          <w:color w:val="212121"/>
+          <w:sz w:val="26"/>
+          <w:szCs w:val="26"/>
+        </w:rPr>
+        <w:t xml:space="preserve"> </w:t>
       </w:r>
       <w:proofErr w:type="gramStart"/>
       <w:r>
@@ -5463,7 +5860,27 @@
           <w:sz w:val="26"/>
           <w:szCs w:val="26"/>
         </w:rPr>
-        <w:t>Testing with Dagster June 2026</w:t>
+        <w:t xml:space="preserve">Testing with </w:t>
+      </w:r>
+      <w:proofErr w:type="spellStart"/>
+      <w:r>
+        <w:rPr>
+          <w:rFonts w:ascii="Helvetica" w:eastAsia="Times New Roman" w:hAnsi="Helvetica" w:cs="Helvetica"/>
+          <w:color w:val="212121"/>
+          <w:sz w:val="26"/>
+          <w:szCs w:val="26"/>
+        </w:rPr>
+        <w:t>Dagster</w:t>
+      </w:r>
+      <w:proofErr w:type="spellEnd"/>
+      <w:r>
+        <w:rPr>
+          <w:rFonts w:ascii="Helvetica" w:eastAsia="Times New Roman" w:hAnsi="Helvetica" w:cs="Helvetica"/>
+          <w:color w:val="212121"/>
+          <w:sz w:val="26"/>
+          <w:szCs w:val="26"/>
+        </w:rPr>
+        <w:t xml:space="preserve"> June 2026</w:t>
       </w:r>
       <w:r>
         <w:rPr>

</xml_diff>

<commit_message>
Added FEC project, github  link
</commit_message>
<xml_diff>
--- a/cv/ScottMcKissockCV.docx
+++ b/cv/ScottMcKissockCV.docx
@@ -107,55 +107,58 @@
           <w:szCs w:val="24"/>
         </w:rPr>
       </w:pPr>
-      <w:r>
-        <w:rPr>
-          <w:rFonts w:ascii="Helvetica" w:eastAsia="Times New Roman" w:hAnsi="Helvetica" w:cs="Helvetica"/>
-          <w:color w:val="212121"/>
-          <w:sz w:val="24"/>
-          <w:szCs w:val="24"/>
-        </w:rPr>
-        <w:t>https://smckissock.github.io/work-samples/</w:t>
-      </w:r>
-    </w:p>
-    <w:p>
-      <w:pPr>
-        <w:shd w:val="clear" w:color="auto" w:fill="FFFFFF"/>
-        <w:spacing w:after="0" w:line="240" w:lineRule="auto"/>
-        <w:rPr>
-          <w:rFonts w:ascii="Helvetica" w:eastAsia="Times New Roman" w:hAnsi="Helvetica" w:cs="Helvetica"/>
-          <w:color w:val="212121"/>
-          <w:sz w:val="24"/>
-          <w:szCs w:val="24"/>
-        </w:rPr>
-      </w:pPr>
-      <w:r>
-        <w:rPr>
-          <w:rFonts w:ascii="Helvetica" w:eastAsia="Times New Roman" w:hAnsi="Helvetica" w:cs="Helvetica"/>
-          <w:color w:val="212121"/>
-          <w:sz w:val="24"/>
-          <w:szCs w:val="24"/>
-        </w:rPr>
-        <w:t xml:space="preserve">Active </w:t>
-      </w:r>
-      <w:proofErr w:type="gramStart"/>
-      <w:r>
-        <w:rPr>
-          <w:rFonts w:ascii="Helvetica" w:eastAsia="Times New Roman" w:hAnsi="Helvetica" w:cs="Helvetica"/>
-          <w:color w:val="212121"/>
-          <w:sz w:val="24"/>
-          <w:szCs w:val="24"/>
-        </w:rPr>
-        <w:t>top secret</w:t>
-      </w:r>
-      <w:proofErr w:type="gramEnd"/>
-      <w:r>
-        <w:rPr>
-          <w:rFonts w:ascii="Helvetica" w:eastAsia="Times New Roman" w:hAnsi="Helvetica" w:cs="Helvetica"/>
-          <w:color w:val="212121"/>
-          <w:sz w:val="24"/>
-          <w:szCs w:val="24"/>
-        </w:rPr>
-        <w:t xml:space="preserve"> clearance </w:t>
+      <w:hyperlink r:id="rId9" w:history="1">
+        <w:r>
+          <w:rPr>
+            <w:rStyle w:val="Hyperlink"/>
+            <w:rFonts w:ascii="Helvetica" w:eastAsia="Times New Roman" w:hAnsi="Helvetica" w:cs="Helvetica"/>
+            <w:sz w:val="24"/>
+            <w:szCs w:val="24"/>
+          </w:rPr>
+          <w:t>https://smckissock.github.io/work-samples</w:t>
+        </w:r>
+      </w:hyperlink>
+    </w:p>
+    <w:p>
+      <w:pPr>
+        <w:shd w:val="clear" w:color="auto" w:fill="FFFFFF"/>
+        <w:spacing w:after="0" w:line="240" w:lineRule="auto"/>
+        <w:rPr>
+          <w:rFonts w:ascii="Helvetica" w:eastAsia="Times New Roman" w:hAnsi="Helvetica" w:cs="Helvetica"/>
+          <w:color w:val="212121"/>
+          <w:sz w:val="24"/>
+          <w:szCs w:val="24"/>
+        </w:rPr>
+      </w:pPr>
+      <w:r>
+        <w:rPr>
+          <w:rFonts w:ascii="Helvetica" w:eastAsia="Times New Roman" w:hAnsi="Helvetica" w:cs="Helvetica"/>
+          <w:color w:val="212121"/>
+          <w:sz w:val="24"/>
+          <w:szCs w:val="24"/>
+        </w:rPr>
+        <w:t>https://www.linkedin.com/in/scott-mckissock</w:t>
+      </w:r>
+    </w:p>
+    <w:p>
+      <w:pPr>
+        <w:shd w:val="clear" w:color="auto" w:fill="FFFFFF"/>
+        <w:spacing w:after="0" w:line="240" w:lineRule="auto"/>
+        <w:rPr>
+          <w:rFonts w:ascii="Helvetica" w:eastAsia="Times New Roman" w:hAnsi="Helvetica" w:cs="Helvetica"/>
+          <w:color w:val="212121"/>
+          <w:sz w:val="24"/>
+          <w:szCs w:val="24"/>
+        </w:rPr>
+      </w:pPr>
+      <w:r>
+        <w:rPr>
+          <w:rFonts w:ascii="Helvetica" w:eastAsia="Times New Roman" w:hAnsi="Helvetica" w:cs="Helvetica"/>
+          <w:color w:val="212121"/>
+          <w:sz w:val="24"/>
+          <w:szCs w:val="24"/>
+        </w:rPr>
+        <w:t xml:space="preserve">Active top secret clearance </w:t>
       </w:r>
     </w:p>
     <w:p>
@@ -237,25 +240,34 @@
           <w:sz w:val="24"/>
           <w:szCs w:val="24"/>
         </w:rPr>
-        <w:t>Software Architect and Tech Lead</w:t>
-      </w:r>
-      <w:r>
-        <w:rPr>
-          <w:rFonts w:ascii="Helvetica" w:eastAsia="Times New Roman" w:hAnsi="Helvetica" w:cs="Helvetica"/>
-          <w:color w:val="212121"/>
-          <w:sz w:val="24"/>
-          <w:szCs w:val="24"/>
-        </w:rPr>
-        <w:t xml:space="preserve"> </w:t>
-      </w:r>
-      <w:r>
-        <w:rPr>
-          <w:rFonts w:ascii="Helvetica" w:eastAsia="Times New Roman" w:hAnsi="Helvetica" w:cs="Helvetica"/>
-          <w:color w:val="212121"/>
-          <w:sz w:val="24"/>
-          <w:szCs w:val="24"/>
-        </w:rPr>
-        <w:t>with 25+ years of experience designing, implementing, and managing mission-critical systems for international development projects. Expert in cloud-based data</w:t>
+        <w:t xml:space="preserve">Data engineer and full stack developer </w:t>
+      </w:r>
+      <w:r>
+        <w:rPr>
+          <w:rFonts w:ascii="Helvetica" w:eastAsia="Times New Roman" w:hAnsi="Helvetica" w:cs="Helvetica"/>
+          <w:color w:val="212121"/>
+          <w:sz w:val="24"/>
+          <w:szCs w:val="24"/>
+        </w:rPr>
+        <w:t xml:space="preserve">with 25+ years of experience designing, implementing, and managing mission-critical </w:t>
+      </w:r>
+      <w:r>
+        <w:rPr>
+          <w:rFonts w:ascii="Helvetica" w:eastAsia="Times New Roman" w:hAnsi="Helvetica" w:cs="Helvetica"/>
+          <w:color w:val="212121"/>
+          <w:sz w:val="24"/>
+          <w:szCs w:val="24"/>
+        </w:rPr>
+        <w:t xml:space="preserve">data </w:t>
+      </w:r>
+      <w:r>
+        <w:rPr>
+          <w:rFonts w:ascii="Helvetica" w:eastAsia="Times New Roman" w:hAnsi="Helvetica" w:cs="Helvetica"/>
+          <w:color w:val="212121"/>
+          <w:sz w:val="24"/>
+          <w:szCs w:val="24"/>
+        </w:rPr>
+        <w:t>systems for international development projects. Expert in cloud-based data</w:t>
       </w:r>
       <w:r>
         <w:rPr>
@@ -511,7 +523,16 @@
           <w:bCs/>
           <w:color w:val="212121"/>
         </w:rPr>
-        <w:t>February 2025</w:t>
+        <w:t>March</w:t>
+      </w:r>
+      <w:r>
+        <w:rPr>
+          <w:rFonts w:ascii="Helvetica" w:eastAsia="Times New Roman" w:hAnsi="Helvetica" w:cs="Helvetica"/>
+          <w:b/>
+          <w:bCs/>
+          <w:color w:val="212121"/>
+        </w:rPr>
+        <w:t xml:space="preserve"> 2025</w:t>
       </w:r>
       <w:r>
         <w:rPr>
@@ -995,7 +1016,7 @@
           <w:sz w:val="24"/>
           <w:szCs w:val="24"/>
         </w:rPr>
-        <w:t xml:space="preserve"> which USAID implementing partners report against quarterly. Developed reports, fact sheets, and dashboards (d3.js) to present this information to a </w:t>
+        <w:t xml:space="preserve"> which USAID implementing partners report against quarterly. </w:t>
       </w:r>
       <w:r>
         <w:rPr>
@@ -1005,7 +1026,7 @@
           <w:szCs w:val="24"/>
         </w:rPr>
         <w:lastRenderedPageBreak/>
-        <w:t>variety of stakeholders.</w:t>
+        <w:t>Developed reports, fact sheets, and dashboards (d3.js) to present this information to a variety of stakeholders.</w:t>
       </w:r>
       <w:r>
         <w:rPr>
@@ -2034,7 +2055,6 @@
           <w:sz w:val="24"/>
           <w:szCs w:val="24"/>
         </w:rPr>
-        <w:lastRenderedPageBreak/>
         <w:pict w14:anchorId="717662AF">
           <v:rect id="_x0000_i1025" style="width:0;height:0" o:hralign="center" o:hrstd="t" o:hrnoshade="t" o:hr="t" fillcolor="#212121" stroked="f"/>
         </w:pict>
@@ -3086,6 +3106,7 @@
           <w:sz w:val="24"/>
           <w:szCs w:val="24"/>
         </w:rPr>
+        <w:lastRenderedPageBreak/>
         <w:t>Tea</w:t>
       </w:r>
       <w:r>
@@ -3122,17 +3143,7 @@
           <w:sz w:val="24"/>
           <w:szCs w:val="24"/>
         </w:rPr>
-        <w:t xml:space="preserve"> and </w:t>
-      </w:r>
-      <w:r>
-        <w:rPr>
-          <w:rFonts w:ascii="Helvetica" w:eastAsia="Times New Roman" w:hAnsi="Helvetica" w:cs="Helvetica"/>
-          <w:color w:val="212121"/>
-          <w:sz w:val="24"/>
-          <w:szCs w:val="24"/>
-        </w:rPr>
-        <w:lastRenderedPageBreak/>
-        <w:t>plan workforce levels. </w:t>
+        <w:t xml:space="preserve"> and plan workforce levels. </w:t>
       </w:r>
       <w:r>
         <w:rPr>
@@ -4294,6 +4305,7 @@
           <w:sz w:val="24"/>
           <w:szCs w:val="24"/>
         </w:rPr>
+        <w:lastRenderedPageBreak/>
         <w:t>Developed usaidmedia.org, a website for curating and searching media coverage of USAID since February 2025 shutdown. The media search site is available to the public</w:t>
       </w:r>
       <w:r>
@@ -4303,17 +4315,7 @@
           <w:sz w:val="24"/>
           <w:szCs w:val="24"/>
         </w:rPr>
-        <w:t xml:space="preserve"> </w:t>
-      </w:r>
-      <w:r>
-        <w:rPr>
-          <w:rFonts w:ascii="Helvetica" w:eastAsia="Times New Roman" w:hAnsi="Helvetica" w:cs="Helvetica"/>
-          <w:color w:val="212121"/>
-          <w:sz w:val="24"/>
-          <w:szCs w:val="24"/>
-        </w:rPr>
-        <w:lastRenderedPageBreak/>
-        <w:t>and</w:t>
+        <w:t xml:space="preserve"> and</w:t>
       </w:r>
       <w:r>
         <w:rPr>
@@ -5535,7 +5537,6 @@
           <w:sz w:val="29"/>
           <w:szCs w:val="29"/>
         </w:rPr>
-        <w:lastRenderedPageBreak/>
         <w:t>Professional Certifications</w:t>
       </w:r>
     </w:p>
@@ -5559,6 +5560,65 @@
         <w:spacing w:after="0" w:line="240" w:lineRule="auto"/>
         <w:rPr>
           <w:rFonts w:ascii="Helvetica" w:eastAsia="Times New Roman" w:hAnsi="Helvetica" w:cs="Helvetica"/>
+          <w:color w:val="212121"/>
+          <w:sz w:val="24"/>
+          <w:szCs w:val="24"/>
+        </w:rPr>
+      </w:pPr>
+      <w:r>
+        <w:rPr>
+          <w:rFonts w:ascii="Helvetica" w:eastAsia="Times New Roman" w:hAnsi="Helvetica" w:cs="Helvetica"/>
+          <w:color w:val="212121"/>
+          <w:sz w:val="24"/>
+          <w:szCs w:val="24"/>
+        </w:rPr>
+        <w:t>Google</w:t>
+      </w:r>
+      <w:r>
+        <w:rPr>
+          <w:rFonts w:ascii="Helvetica" w:eastAsia="Times New Roman" w:hAnsi="Helvetica" w:cs="Helvetica"/>
+          <w:color w:val="212121"/>
+          <w:sz w:val="24"/>
+          <w:szCs w:val="24"/>
+        </w:rPr>
+        <w:t xml:space="preserve"> </w:t>
+      </w:r>
+      <w:r>
+        <w:rPr>
+          <w:rFonts w:ascii="Helvetica" w:eastAsia="Times New Roman" w:hAnsi="Helvetica" w:cs="Helvetica"/>
+          <w:color w:val="212121"/>
+          <w:sz w:val="24"/>
+          <w:szCs w:val="24"/>
+        </w:rPr>
+        <w:t xml:space="preserve">Professional Data </w:t>
+      </w:r>
+      <w:proofErr w:type="gramStart"/>
+      <w:r>
+        <w:rPr>
+          <w:rFonts w:ascii="Helvetica" w:eastAsia="Times New Roman" w:hAnsi="Helvetica" w:cs="Helvetica"/>
+          <w:color w:val="212121"/>
+          <w:sz w:val="24"/>
+          <w:szCs w:val="24"/>
+        </w:rPr>
+        <w:t>Engineer  August</w:t>
+      </w:r>
+      <w:proofErr w:type="gramEnd"/>
+      <w:r>
+        <w:rPr>
+          <w:rFonts w:ascii="Helvetica" w:eastAsia="Times New Roman" w:hAnsi="Helvetica" w:cs="Helvetica"/>
+          <w:color w:val="212121"/>
+          <w:sz w:val="24"/>
+          <w:szCs w:val="24"/>
+        </w:rPr>
+        <w:t xml:space="preserve"> 2025</w:t>
+      </w:r>
+    </w:p>
+    <w:p>
+      <w:pPr>
+        <w:shd w:val="clear" w:color="auto" w:fill="FFFFFF"/>
+        <w:spacing w:after="0" w:line="240" w:lineRule="auto"/>
+        <w:rPr>
+          <w:rFonts w:ascii="Helvetica" w:eastAsia="Times New Roman" w:hAnsi="Helvetica" w:cs="Helvetica"/>
           <w:b/>
           <w:bCs/>
           <w:color w:val="212121"/>
@@ -5566,7 +5626,11 @@
           <w:szCs w:val="29"/>
         </w:rPr>
       </w:pPr>
-      <w:r>
+    </w:p>
+    <w:p>
+      <w:pPr>
+        <w:shd w:val="clear" w:color="auto" w:fill="FFFFFF"/>
+        <w:spacing w:after="0" w:line="240" w:lineRule="auto"/>
         <w:rPr>
           <w:rFonts w:ascii="Helvetica" w:eastAsia="Times New Roman" w:hAnsi="Helvetica" w:cs="Helvetica"/>
           <w:b/>
@@ -5575,15 +5639,16 @@
           <w:sz w:val="29"/>
           <w:szCs w:val="29"/>
         </w:rPr>
-        <w:t>Google</w:t>
-      </w:r>
-    </w:p>
-    <w:p>
-      <w:pPr>
-        <w:shd w:val="clear" w:color="auto" w:fill="FFFFFF"/>
-        <w:spacing w:after="0" w:line="240" w:lineRule="auto"/>
-        <w:rPr>
-          <w:rFonts w:ascii="Helvetica" w:eastAsia="Times New Roman" w:hAnsi="Helvetica" w:cs="Helvetica"/>
+      </w:pPr>
+    </w:p>
+    <w:p>
+      <w:pPr>
+        <w:shd w:val="clear" w:color="auto" w:fill="FFFFFF"/>
+        <w:spacing w:after="0" w:line="240" w:lineRule="auto"/>
+        <w:rPr>
+          <w:rFonts w:ascii="Helvetica" w:eastAsia="Times New Roman" w:hAnsi="Helvetica" w:cs="Helvetica"/>
+          <w:b/>
+          <w:bCs/>
           <w:color w:val="212121"/>
           <w:sz w:val="29"/>
           <w:szCs w:val="29"/>
@@ -5592,29 +5657,93 @@
       <w:r>
         <w:rPr>
           <w:rFonts w:ascii="Helvetica" w:eastAsia="Times New Roman" w:hAnsi="Helvetica" w:cs="Helvetica"/>
+          <w:b/>
+          <w:bCs/>
           <w:color w:val="212121"/>
           <w:sz w:val="29"/>
           <w:szCs w:val="29"/>
         </w:rPr>
-        <w:t xml:space="preserve">Professional Data </w:t>
+        <w:t>Training</w:t>
+      </w:r>
+    </w:p>
+    <w:p>
+      <w:pPr>
+        <w:shd w:val="clear" w:color="auto" w:fill="FFFFFF"/>
+        <w:spacing w:after="0" w:line="240" w:lineRule="auto"/>
+        <w:rPr>
+          <w:rFonts w:ascii="Helvetica" w:eastAsia="Times New Roman" w:hAnsi="Helvetica" w:cs="Helvetica"/>
+          <w:color w:val="212121"/>
+          <w:sz w:val="26"/>
+          <w:szCs w:val="26"/>
+        </w:rPr>
+      </w:pPr>
+    </w:p>
+    <w:p>
+      <w:pPr>
+        <w:shd w:val="clear" w:color="auto" w:fill="FFFFFF"/>
+        <w:spacing w:after="0" w:line="240" w:lineRule="auto"/>
+        <w:rPr>
+          <w:rFonts w:ascii="Helvetica" w:eastAsia="Times New Roman" w:hAnsi="Helvetica" w:cs="Helvetica"/>
+          <w:color w:val="212121"/>
+          <w:sz w:val="24"/>
+          <w:szCs w:val="24"/>
+        </w:rPr>
+      </w:pPr>
+      <w:r>
+        <w:rPr>
+          <w:rFonts w:ascii="Helvetica" w:eastAsia="Times New Roman" w:hAnsi="Helvetica" w:cs="Helvetica"/>
+          <w:color w:val="212121"/>
+          <w:sz w:val="24"/>
+          <w:szCs w:val="24"/>
+        </w:rPr>
+        <w:t>Udemy LLM Engineering March 2025</w:t>
+      </w:r>
+      <w:r>
+        <w:rPr>
+          <w:rFonts w:ascii="Helvetica" w:eastAsia="Times New Roman" w:hAnsi="Helvetica" w:cs="Helvetica"/>
+          <w:color w:val="212121"/>
+          <w:sz w:val="24"/>
+          <w:szCs w:val="24"/>
+        </w:rPr>
+        <w:br/>
+      </w:r>
+      <w:proofErr w:type="spellStart"/>
+      <w:r>
+        <w:rPr>
+          <w:rFonts w:ascii="Helvetica" w:eastAsia="Times New Roman" w:hAnsi="Helvetica" w:cs="Helvetica"/>
+          <w:color w:val="212121"/>
+          <w:sz w:val="24"/>
+          <w:szCs w:val="24"/>
+        </w:rPr>
+        <w:t>Dagster</w:t>
+      </w:r>
+      <w:proofErr w:type="spellEnd"/>
+      <w:r>
+        <w:rPr>
+          <w:rFonts w:ascii="Helvetica" w:eastAsia="Times New Roman" w:hAnsi="Helvetica" w:cs="Helvetica"/>
+          <w:color w:val="212121"/>
+          <w:sz w:val="24"/>
+          <w:szCs w:val="24"/>
+        </w:rPr>
+        <w:t xml:space="preserve"> </w:t>
       </w:r>
       <w:proofErr w:type="gramStart"/>
       <w:r>
         <w:rPr>
           <w:rFonts w:ascii="Helvetica" w:eastAsia="Times New Roman" w:hAnsi="Helvetica" w:cs="Helvetica"/>
           <w:color w:val="212121"/>
-          <w:sz w:val="29"/>
-          <w:szCs w:val="29"/>
-        </w:rPr>
-        <w:t>Engineer  August</w:t>
+          <w:sz w:val="24"/>
+          <w:szCs w:val="24"/>
+        </w:rPr>
+        <w:t>Essentials  May</w:t>
       </w:r>
       <w:proofErr w:type="gramEnd"/>
       <w:r>
         <w:rPr>
           <w:rFonts w:ascii="Helvetica" w:eastAsia="Times New Roman" w:hAnsi="Helvetica" w:cs="Helvetica"/>
           <w:color w:val="212121"/>
-          <w:sz w:val="29"/>
-          <w:szCs w:val="29"/>
+          <w:sz w:val="24"/>
+          <w:szCs w:val="24"/>
         </w:rPr>
         <w:t xml:space="preserve"> 2025</w:t>
       </w:r>
@@ -5625,155 +5754,18 @@
         <w:spacing w:after="0" w:line="240" w:lineRule="auto"/>
         <w:rPr>
           <w:rFonts w:ascii="Helvetica" w:eastAsia="Times New Roman" w:hAnsi="Helvetica" w:cs="Helvetica"/>
-          <w:b/>
-          <w:bCs/>
-          <w:color w:val="212121"/>
-          <w:sz w:val="29"/>
-          <w:szCs w:val="29"/>
-        </w:rPr>
-      </w:pPr>
-    </w:p>
-    <w:p>
-      <w:pPr>
-        <w:shd w:val="clear" w:color="auto" w:fill="FFFFFF"/>
-        <w:spacing w:after="0" w:line="240" w:lineRule="auto"/>
-        <w:rPr>
-          <w:rFonts w:ascii="Helvetica" w:eastAsia="Times New Roman" w:hAnsi="Helvetica" w:cs="Helvetica"/>
-          <w:b/>
-          <w:bCs/>
-          <w:color w:val="212121"/>
-          <w:sz w:val="29"/>
-          <w:szCs w:val="29"/>
-        </w:rPr>
-      </w:pPr>
-    </w:p>
-    <w:p>
-      <w:pPr>
-        <w:shd w:val="clear" w:color="auto" w:fill="FFFFFF"/>
-        <w:spacing w:after="0" w:line="240" w:lineRule="auto"/>
-        <w:rPr>
-          <w:rFonts w:ascii="Helvetica" w:eastAsia="Times New Roman" w:hAnsi="Helvetica" w:cs="Helvetica"/>
-          <w:b/>
-          <w:bCs/>
-          <w:color w:val="212121"/>
-          <w:sz w:val="29"/>
-          <w:szCs w:val="29"/>
-        </w:rPr>
-      </w:pPr>
-      <w:r>
-        <w:rPr>
-          <w:rFonts w:ascii="Helvetica" w:eastAsia="Times New Roman" w:hAnsi="Helvetica" w:cs="Helvetica"/>
-          <w:b/>
-          <w:bCs/>
-          <w:color w:val="212121"/>
-          <w:sz w:val="29"/>
-          <w:szCs w:val="29"/>
-        </w:rPr>
-        <w:t>Training</w:t>
-      </w:r>
-    </w:p>
-    <w:p>
-      <w:pPr>
-        <w:shd w:val="clear" w:color="auto" w:fill="FFFFFF"/>
-        <w:spacing w:after="0" w:line="240" w:lineRule="auto"/>
-        <w:rPr>
-          <w:rFonts w:ascii="Helvetica" w:eastAsia="Times New Roman" w:hAnsi="Helvetica" w:cs="Helvetica"/>
-          <w:color w:val="212121"/>
-          <w:sz w:val="26"/>
-          <w:szCs w:val="26"/>
-        </w:rPr>
-      </w:pPr>
-    </w:p>
-    <w:p>
-      <w:pPr>
-        <w:shd w:val="clear" w:color="auto" w:fill="FFFFFF"/>
-        <w:spacing w:after="0" w:line="240" w:lineRule="auto"/>
-        <w:rPr>
-          <w:rFonts w:ascii="Times New Roman" w:eastAsia="Times New Roman" w:hAnsi="Times New Roman" w:cs="Times New Roman"/>
-          <w:sz w:val="24"/>
-          <w:szCs w:val="24"/>
-        </w:rPr>
-      </w:pPr>
-      <w:r>
-        <w:rPr>
-          <w:rFonts w:ascii="Helvetica" w:eastAsia="Times New Roman" w:hAnsi="Helvetica" w:cs="Helvetica"/>
-          <w:b/>
-          <w:bCs/>
-          <w:color w:val="212121"/>
-          <w:sz w:val="26"/>
-          <w:szCs w:val="26"/>
-        </w:rPr>
-        <w:t>Udemy</w:t>
-      </w:r>
-      <w:r>
-        <w:rPr>
-          <w:rFonts w:ascii="Helvetica" w:eastAsia="Times New Roman" w:hAnsi="Helvetica" w:cs="Helvetica"/>
-          <w:color w:val="212121"/>
-          <w:sz w:val="26"/>
-          <w:szCs w:val="26"/>
-        </w:rPr>
-        <w:t xml:space="preserve">  </w:t>
-      </w:r>
-      <w:r>
-        <w:rPr>
-          <w:rFonts w:ascii="Helvetica" w:eastAsia="Times New Roman" w:hAnsi="Helvetica" w:cs="Helvetica"/>
-          <w:color w:val="212121"/>
-          <w:sz w:val="26"/>
-          <w:szCs w:val="26"/>
-        </w:rPr>
-        <w:br/>
-      </w:r>
-      <w:r>
-        <w:rPr>
-          <w:rFonts w:ascii="Helvetica" w:eastAsia="Times New Roman" w:hAnsi="Helvetica" w:cs="Helvetica"/>
-          <w:color w:val="212121"/>
-          <w:sz w:val="26"/>
-          <w:szCs w:val="26"/>
-        </w:rPr>
-        <w:t>LLM Engineering March 2025</w:t>
-      </w:r>
-      <w:r>
-        <w:rPr>
-          <w:rFonts w:ascii="Helvetica" w:eastAsia="Times New Roman" w:hAnsi="Helvetica" w:cs="Helvetica"/>
-          <w:color w:val="212121"/>
-          <w:sz w:val="26"/>
-          <w:szCs w:val="26"/>
-        </w:rPr>
-        <w:br/>
-      </w:r>
-      <w:r>
-        <w:rPr>
-          <w:rFonts w:ascii="Times New Roman" w:eastAsia="Times New Roman" w:hAnsi="Times New Roman" w:cs="Times New Roman"/>
-          <w:sz w:val="24"/>
-          <w:szCs w:val="24"/>
-        </w:rPr>
-        <w:pict w14:anchorId="63B09902">
-          <v:rect id="_x0000_i1030" style="width:0;height:0" o:hralign="center" o:hrstd="t" o:hrnoshade="t" o:hr="t" fillcolor="#212121" stroked="f"/>
-        </w:pict>
-      </w:r>
-    </w:p>
-    <w:p>
-      <w:pPr>
-        <w:shd w:val="clear" w:color="auto" w:fill="FFFFFF"/>
-        <w:spacing w:after="0" w:line="240" w:lineRule="auto"/>
-        <w:rPr>
-          <w:rFonts w:ascii="Helvetica" w:eastAsia="Times New Roman" w:hAnsi="Helvetica" w:cs="Helvetica"/>
-          <w:b/>
-          <w:bCs/>
-          <w:color w:val="212121"/>
-          <w:sz w:val="26"/>
-          <w:szCs w:val="26"/>
+          <w:color w:val="212121"/>
+          <w:sz w:val="24"/>
+          <w:szCs w:val="24"/>
         </w:rPr>
       </w:pPr>
       <w:proofErr w:type="spellStart"/>
       <w:r>
         <w:rPr>
           <w:rFonts w:ascii="Helvetica" w:eastAsia="Times New Roman" w:hAnsi="Helvetica" w:cs="Helvetica"/>
-          <w:b/>
-          <w:bCs/>
-          <w:color w:val="212121"/>
-          <w:sz w:val="26"/>
-          <w:szCs w:val="26"/>
+          <w:color w:val="212121"/>
+          <w:sz w:val="24"/>
+          <w:szCs w:val="24"/>
         </w:rPr>
         <w:t>Dagster</w:t>
       </w:r>
@@ -5781,33 +5773,28 @@
       <w:r>
         <w:rPr>
           <w:rFonts w:ascii="Helvetica" w:eastAsia="Times New Roman" w:hAnsi="Helvetica" w:cs="Helvetica"/>
-          <w:b/>
-          <w:bCs/>
-          <w:color w:val="212121"/>
-          <w:sz w:val="26"/>
-          <w:szCs w:val="26"/>
-        </w:rPr>
-        <w:t xml:space="preserve"> University</w:t>
-      </w:r>
-    </w:p>
-    <w:p>
-      <w:pPr>
-        <w:shd w:val="clear" w:color="auto" w:fill="FFFFFF"/>
-        <w:spacing w:after="0" w:line="240" w:lineRule="auto"/>
-        <w:rPr>
-          <w:rFonts w:ascii="Helvetica" w:eastAsia="Times New Roman" w:hAnsi="Helvetica" w:cs="Helvetica"/>
-          <w:color w:val="212121"/>
-          <w:sz w:val="26"/>
-          <w:szCs w:val="26"/>
-        </w:rPr>
-      </w:pPr>
+          <w:color w:val="212121"/>
+          <w:sz w:val="24"/>
+          <w:szCs w:val="24"/>
+        </w:rPr>
+        <w:t xml:space="preserve"> </w:t>
+      </w:r>
+      <w:r>
+        <w:rPr>
+          <w:rFonts w:ascii="Helvetica" w:eastAsia="Times New Roman" w:hAnsi="Helvetica" w:cs="Helvetica"/>
+          <w:color w:val="212121"/>
+          <w:sz w:val="24"/>
+          <w:szCs w:val="24"/>
+        </w:rPr>
+        <w:t xml:space="preserve">Testing with </w:t>
+      </w:r>
       <w:proofErr w:type="spellStart"/>
       <w:r>
         <w:rPr>
           <w:rFonts w:ascii="Helvetica" w:eastAsia="Times New Roman" w:hAnsi="Helvetica" w:cs="Helvetica"/>
           <w:color w:val="212121"/>
-          <w:sz w:val="26"/>
-          <w:szCs w:val="26"/>
+          <w:sz w:val="24"/>
+          <w:szCs w:val="24"/>
         </w:rPr>
         <w:t>Dagster</w:t>
       </w:r>
@@ -5816,69 +5803,8 @@
         <w:rPr>
           <w:rFonts w:ascii="Helvetica" w:eastAsia="Times New Roman" w:hAnsi="Helvetica" w:cs="Helvetica"/>
           <w:color w:val="212121"/>
-          <w:sz w:val="26"/>
-          <w:szCs w:val="26"/>
-        </w:rPr>
-        <w:t xml:space="preserve"> </w:t>
-      </w:r>
-      <w:proofErr w:type="gramStart"/>
-      <w:r>
-        <w:rPr>
-          <w:rFonts w:ascii="Helvetica" w:eastAsia="Times New Roman" w:hAnsi="Helvetica" w:cs="Helvetica"/>
-          <w:color w:val="212121"/>
-          <w:sz w:val="26"/>
-          <w:szCs w:val="26"/>
-        </w:rPr>
-        <w:t>Essentials  May</w:t>
-      </w:r>
-      <w:proofErr w:type="gramEnd"/>
-      <w:r>
-        <w:rPr>
-          <w:rFonts w:ascii="Helvetica" w:eastAsia="Times New Roman" w:hAnsi="Helvetica" w:cs="Helvetica"/>
-          <w:color w:val="212121"/>
-          <w:sz w:val="26"/>
-          <w:szCs w:val="26"/>
-        </w:rPr>
-        <w:t xml:space="preserve"> 2025</w:t>
-      </w:r>
-    </w:p>
-    <w:p>
-      <w:pPr>
-        <w:shd w:val="clear" w:color="auto" w:fill="FFFFFF"/>
-        <w:spacing w:after="0" w:line="240" w:lineRule="auto"/>
-        <w:rPr>
-          <w:rFonts w:ascii="Helvetica" w:eastAsia="Times New Roman" w:hAnsi="Helvetica" w:cs="Helvetica"/>
-          <w:color w:val="212121"/>
-          <w:sz w:val="26"/>
-          <w:szCs w:val="26"/>
-        </w:rPr>
-      </w:pPr>
-      <w:r>
-        <w:rPr>
-          <w:rFonts w:ascii="Helvetica" w:eastAsia="Times New Roman" w:hAnsi="Helvetica" w:cs="Helvetica"/>
-          <w:color w:val="212121"/>
-          <w:sz w:val="26"/>
-          <w:szCs w:val="26"/>
-        </w:rPr>
-        <w:t xml:space="preserve">Testing with </w:t>
-      </w:r>
-      <w:proofErr w:type="spellStart"/>
-      <w:r>
-        <w:rPr>
-          <w:rFonts w:ascii="Helvetica" w:eastAsia="Times New Roman" w:hAnsi="Helvetica" w:cs="Helvetica"/>
-          <w:color w:val="212121"/>
-          <w:sz w:val="26"/>
-          <w:szCs w:val="26"/>
-        </w:rPr>
-        <w:t>Dagster</w:t>
-      </w:r>
-      <w:proofErr w:type="spellEnd"/>
-      <w:r>
-        <w:rPr>
-          <w:rFonts w:ascii="Helvetica" w:eastAsia="Times New Roman" w:hAnsi="Helvetica" w:cs="Helvetica"/>
-          <w:color w:val="212121"/>
-          <w:sz w:val="26"/>
-          <w:szCs w:val="26"/>
+          <w:sz w:val="24"/>
+          <w:szCs w:val="24"/>
         </w:rPr>
         <w:t xml:space="preserve"> June 2026</w:t>
       </w:r>
@@ -5886,8 +5812,8 @@
         <w:rPr>
           <w:rFonts w:ascii="Helvetica" w:eastAsia="Times New Roman" w:hAnsi="Helvetica" w:cs="Helvetica"/>
           <w:color w:val="212121"/>
-          <w:sz w:val="26"/>
-          <w:szCs w:val="26"/>
+          <w:sz w:val="24"/>
+          <w:szCs w:val="24"/>
         </w:rPr>
         <w:br/>
       </w:r>

</xml_diff>